<commit_message>
Update DOCX and PPTX docs with correct credentials and role names
- IMGC_PAS_Application_Guide.docx: Fix login credentials table
  (emails @pas.com → @imgc.com, password123 → demo123), update role
  names (Agent → Operations, Auditor → Viewer) across credentials
  and RBAC permissions tables
- IMGC_PAS_Client_Demo.pptx: Fix role names on Slide 2 (auth) and
  Slide 14 (admin) from Agent/Auditor to Operations/Viewer

Co-Authored-By: Claude Opus 4.6 <noreply@anthropic.com>
</commit_message>
<xml_diff>
--- a/IMGC_PAS_Application_Guide.docx
+++ b/IMGC_PAS_Application_Guide.docx
@@ -594,7 +594,7 @@
                 <w:rFonts w:ascii="Calibri" w:hAnsi="Calibri"/>
                 <w:sz w:val="20"/>
               </w:rPr>
-              <w:t>5 Role-Based Access Levels (Admin, Underwriter, Claims, Agent, Auditor)</w:t>
+              <w:t>5 Role-Based Access Levels (Admin, Underwriter, Claims, Opert, Auditor)</w:t>
             </w:r>
           </w:p>
         </w:tc>
@@ -1145,7 +1145,7 @@
                 <w:rFonts w:ascii="Calibri" w:hAnsi="Calibri"/>
                 <w:sz w:val="20"/>
               </w:rPr>
-              <w:t>admin@pas.com</w:t>
+              <w:t>admin@imgc.com</w:t>
             </w:r>
           </w:p>
         </w:tc>
@@ -1160,7 +1160,7 @@
                 <w:rFonts w:ascii="Calibri" w:hAnsi="Calibri"/>
                 <w:sz w:val="20"/>
               </w:rPr>
-              <w:t>password123</w:t>
+              <w:t>demo123</w:t>
             </w:r>
           </w:p>
         </w:tc>
@@ -1192,7 +1192,7 @@
                 <w:rFonts w:ascii="Calibri" w:hAnsi="Calibri"/>
                 <w:sz w:val="20"/>
               </w:rPr>
-              <w:t>underwriter@pas.com</w:t>
+              <w:t>underwriter@imgc.com</w:t>
             </w:r>
           </w:p>
         </w:tc>
@@ -1207,7 +1207,7 @@
                 <w:rFonts w:ascii="Calibri" w:hAnsi="Calibri"/>
                 <w:sz w:val="20"/>
               </w:rPr>
-              <w:t>password123</w:t>
+              <w:t>demo123</w:t>
             </w:r>
           </w:p>
         </w:tc>
@@ -1224,7 +1224,7 @@
                 <w:rFonts w:ascii="Calibri" w:hAnsi="Calibri"/>
                 <w:sz w:val="20"/>
               </w:rPr>
-              <w:t>Claims Adjuster</w:t>
+              <w:t>Claims</w:t>
             </w:r>
           </w:p>
         </w:tc>
@@ -1239,7 +1239,7 @@
                 <w:rFonts w:ascii="Calibri" w:hAnsi="Calibri"/>
                 <w:sz w:val="20"/>
               </w:rPr>
-              <w:t>claims@pas.com</w:t>
+              <w:t>claims@imgc.com</w:t>
             </w:r>
           </w:p>
         </w:tc>
@@ -1254,7 +1254,7 @@
                 <w:rFonts w:ascii="Calibri" w:hAnsi="Calibri"/>
                 <w:sz w:val="20"/>
               </w:rPr>
-              <w:t>password123</w:t>
+              <w:t>demo123</w:t>
             </w:r>
           </w:p>
         </w:tc>
@@ -1271,7 +1271,7 @@
                 <w:rFonts w:ascii="Calibri" w:hAnsi="Calibri"/>
                 <w:sz w:val="20"/>
               </w:rPr>
-              <w:t>Agent</w:t>
+              <w:t>Operations</w:t>
             </w:r>
           </w:p>
         </w:tc>
@@ -1286,7 +1286,7 @@
                 <w:rFonts w:ascii="Calibri" w:hAnsi="Calibri"/>
                 <w:sz w:val="20"/>
               </w:rPr>
-              <w:t>agent@pas.com</w:t>
+              <w:t>ops@imgc.com</w:t>
             </w:r>
           </w:p>
         </w:tc>
@@ -1301,7 +1301,7 @@
                 <w:rFonts w:ascii="Calibri" w:hAnsi="Calibri"/>
                 <w:sz w:val="20"/>
               </w:rPr>
-              <w:t>password123</w:t>
+              <w:t>demo123</w:t>
             </w:r>
           </w:p>
         </w:tc>
@@ -1318,7 +1318,7 @@
                 <w:rFonts w:ascii="Calibri" w:hAnsi="Calibri"/>
                 <w:sz w:val="20"/>
               </w:rPr>
-              <w:t>Auditor</w:t>
+              <w:t>Viewer</w:t>
             </w:r>
           </w:p>
         </w:tc>
@@ -1333,7 +1333,7 @@
                 <w:rFonts w:ascii="Calibri" w:hAnsi="Calibri"/>
                 <w:sz w:val="20"/>
               </w:rPr>
-              <w:t>auditor@pas.com</w:t>
+              <w:t>viewer@imgc.com</w:t>
             </w:r>
           </w:p>
         </w:tc>
@@ -1348,7 +1348,7 @@
                 <w:rFonts w:ascii="Calibri" w:hAnsi="Calibri"/>
                 <w:sz w:val="20"/>
               </w:rPr>
-              <w:t>password123</w:t>
+              <w:t>demo123</w:t>
             </w:r>
           </w:p>
         </w:tc>
@@ -6463,7 +6463,7 @@
                 <w:rFonts w:ascii="Calibri" w:hAnsi="Calibri"/>
                 <w:sz w:val="20"/>
               </w:rPr>
-              <w:t>Claims Adjuster</w:t>
+              <w:t>Claims</w:t>
             </w:r>
           </w:p>
         </w:tc>
@@ -6651,7 +6651,7 @@
                 <w:rFonts w:ascii="Calibri" w:hAnsi="Calibri"/>
                 <w:sz w:val="20"/>
               </w:rPr>
-              <w:t>Agent</w:t>
+              <w:t>Operations</w:t>
             </w:r>
           </w:p>
         </w:tc>
@@ -7722,7 +7722,7 @@
     </w:p>
     <w:p>
       <w:r>
-        <w:t>Every administrative action is logged with: User who performed the action, timestamp, action type, affected entity, and before/after values for data changes. The audit log is immutable and accessible only to Admin and Auditor roles.</w:t>
+        <w:t>Every administrative action is logged with: User who performed the action, timestamp, action type, affected entity, and before/after values for data changes. The audit log is immutable and accessible only to Admin roles.</w:t>
       </w:r>
     </w:p>
     <w:p>
@@ -9095,7 +9095,7 @@
                 <w:color w:val="FFFFFF"/>
                 <w:sz w:val="20"/>
               </w:rPr>
-              <w:t>Agent</w:t>
+              <w:t>Operations</w:t>
             </w:r>
           </w:p>
         </w:tc>
@@ -9115,7 +9115,7 @@
                 <w:color w:val="FFFFFF"/>
                 <w:sz w:val="20"/>
               </w:rPr>
-              <w:t>Auditor</w:t>
+              <w:t>Viewer</w:t>
             </w:r>
           </w:p>
         </w:tc>

</xml_diff>